<commit_message>
Implement LLM layer for invoice extraction
</commit_message>
<xml_diff>
--- a/data/sample_invoice.docx
+++ b/data/sample_invoice.docx
@@ -572,18 +572,7 @@
                                 <w:sz w:val="44"/>
                                 <w:szCs w:val="44"/>
                               </w:rPr>
-                              <w:t>Company Name</w:t>
-                            </w:r>
-                            <w:r>
-                              <w:rPr>
-                                <w:rFonts w:ascii="Arial" w:hAnsi="Arial" w:cs="Arial"/>
-                                <w:b/>
-                                <w:color w:val="595959" w:themeColor="text1" w:themeTint="A6"/>
-                                <w:w w:val="90"/>
-                                <w:sz w:val="44"/>
-                                <w:szCs w:val="44"/>
-                              </w:rPr>
-                              <w:t xml:space="preserve"> Here</w:t>
+                              <w:t>AI Store</w:t>
                             </w:r>
                           </w:p>
                         </w:txbxContent>
@@ -608,7 +597,11 @@
           </mc:Choice>
           <mc:Fallback>
             <w:pict>
-              <v:shape w14:anchorId="34B572AF" id="Text Box 4" o:spid="_x0000_s1030" type="#_x0000_t202" style="position:absolute;margin-left:36.3pt;margin-top:-46.15pt;width:218.4pt;height:41.35pt;z-index:251662336;visibility:visible;mso-wrap-style:square;mso-width-percent:0;mso-height-percent:0;mso-wrap-distance-left:9pt;mso-wrap-distance-top:0;mso-wrap-distance-right:9pt;mso-wrap-distance-bottom:0;mso-position-horizontal:absolute;mso-position-horizontal-relative:page;mso-position-vertical:absolute;mso-position-vertical-relative:text;mso-width-percent:0;mso-height-percent:0;mso-width-relative:margin;mso-height-relative:margin;v-text-anchor:middle" o:gfxdata="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" filled="f" stroked="f" strokeweight=".5pt">
+              <v:shapetype w14:anchorId="34B572AF" id="_x0000_t202" coordsize="21600,21600" o:spt="202" path="m,l,21600r21600,l21600,xe">
+                <v:stroke joinstyle="miter"/>
+                <v:path gradientshapeok="t" o:connecttype="rect"/>
+              </v:shapetype>
+              <v:shape id="Text Box 4" o:spid="_x0000_s1030" type="#_x0000_t202" style="position:absolute;margin-left:36.3pt;margin-top:-46.15pt;width:218.4pt;height:41.35pt;z-index:251662336;visibility:visible;mso-wrap-style:square;mso-width-percent:0;mso-height-percent:0;mso-wrap-distance-left:9pt;mso-wrap-distance-top:0;mso-wrap-distance-right:9pt;mso-wrap-distance-bottom:0;mso-position-horizontal:absolute;mso-position-horizontal-relative:page;mso-position-vertical:absolute;mso-position-vertical-relative:text;mso-width-percent:0;mso-height-percent:0;mso-width-relative:margin;mso-height-relative:margin;v-text-anchor:middle" o:gfxdata="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" filled="f" stroked="f" strokeweight=".5pt">
                 <v:textbox>
                   <w:txbxContent>
                     <w:p>
@@ -632,18 +625,7 @@
                           <w:sz w:val="44"/>
                           <w:szCs w:val="44"/>
                         </w:rPr>
-                        <w:t>Company Name</w:t>
-                      </w:r>
-                      <w:r>
-                        <w:rPr>
-                          <w:rFonts w:ascii="Arial" w:hAnsi="Arial" w:cs="Arial"/>
-                          <w:b/>
-                          <w:color w:val="595959" w:themeColor="text1" w:themeTint="A6"/>
-                          <w:w w:val="90"/>
-                          <w:sz w:val="44"/>
-                          <w:szCs w:val="44"/>
-                        </w:rPr>
-                        <w:t xml:space="preserve"> Here</w:t>
+                        <w:t>AI Store</w:t>
                       </w:r>
                     </w:p>
                   </w:txbxContent>
@@ -3703,6 +3685,17 @@
                               </w:rPr>
                               <w:t>Bill To:</w:t>
                             </w:r>
+                            <w:r>
+                              <w:rPr>
+                                <w:rFonts w:ascii="Arial" w:hAnsi="Arial" w:cs="Arial"/>
+                                <w:b/>
+                                <w:color w:val="595959" w:themeColor="text1" w:themeTint="A6"/>
+                                <w:w w:val="90"/>
+                                <w:sz w:val="36"/>
+                                <w:szCs w:val="36"/>
+                              </w:rPr>
+                              <w:t xml:space="preserve"> </w:t>
+                            </w:r>
                           </w:p>
                         </w:txbxContent>
                       </wps:txbx>
@@ -3726,7 +3719,7 @@
           </mc:Choice>
           <mc:Fallback>
             <w:pict>
-              <v:shape w14:anchorId="218B64D8" id="Text Box 5" o:spid="_x0000_s1034" type="#_x0000_t202" style="position:absolute;margin-left:114.15pt;margin-top:185.7pt;width:239.75pt;height:38.9pt;z-index:251668480;visibility:visible;mso-wrap-style:square;mso-width-percent:0;mso-height-percent:0;mso-wrap-distance-left:9pt;mso-wrap-distance-top:0;mso-wrap-distance-right:9pt;mso-wrap-distance-bottom:0;mso-position-horizontal:absolute;mso-position-horizontal-relative:margin;mso-position-vertical:absolute;mso-position-vertical-relative:page;mso-width-percent:0;mso-height-percent:0;mso-width-relative:margin;mso-height-relative:margin;v-text-anchor:middle" o:gfxdata="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" filled="f" stroked="f" strokeweight=".5pt">
+              <v:shape w14:anchorId="218B64D8" id="Text Box 5" o:spid="_x0000_s1034" type="#_x0000_t202" style="position:absolute;margin-left:114.15pt;margin-top:185.7pt;width:239.75pt;height:38.9pt;z-index:251668480;visibility:visible;mso-wrap-style:square;mso-width-percent:0;mso-height-percent:0;mso-wrap-distance-left:9pt;mso-wrap-distance-top:0;mso-wrap-distance-right:9pt;mso-wrap-distance-bottom:0;mso-position-horizontal:absolute;mso-position-horizontal-relative:margin;mso-position-vertical:absolute;mso-position-vertical-relative:page;mso-width-percent:0;mso-height-percent:0;mso-width-relative:margin;mso-height-relative:margin;v-text-anchor:middle" o:gfxdata="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" filled="f" stroked="f" strokeweight=".5pt">
                 <v:textbox>
                   <w:txbxContent>
                     <w:p>
@@ -3741,7 +3734,6 @@
                           <w:szCs w:val="36"/>
                         </w:rPr>
                       </w:pPr>
-                      <w:bookmarkStart w:id="1" w:name="_GoBack"/>
                       <w:r>
                         <w:rPr>
                           <w:rFonts w:ascii="Arial" w:hAnsi="Arial" w:cs="Arial"/>
@@ -3753,7 +3745,17 @@
                         </w:rPr>
                         <w:t>Bill To:</w:t>
                       </w:r>
-                      <w:bookmarkEnd w:id="1"/>
+                      <w:r>
+                        <w:rPr>
+                          <w:rFonts w:ascii="Arial" w:hAnsi="Arial" w:cs="Arial"/>
+                          <w:b/>
+                          <w:color w:val="595959" w:themeColor="text1" w:themeTint="A6"/>
+                          <w:w w:val="90"/>
+                          <w:sz w:val="36"/>
+                          <w:szCs w:val="36"/>
+                        </w:rPr>
+                        <w:t xml:space="preserve"> </w:t>
+                      </w:r>
                     </w:p>
                   </w:txbxContent>
                 </v:textbox>

</xml_diff>